<commit_message>
docs: marcar chequeo visual en navegador como hecho
</commit_message>
<xml_diff>
--- a/docs/DOCUMENTACION.docx
+++ b/docs/DOCUMENTACION.docx
@@ -2294,24 +2294,35 @@
           <w:sz w:val="22"/>
           <w:b/>
         </w:rPr>
-        <w:t xml:space="preserve">Pendiente:</w:t>
-      </w:r>
-      <w:r>
-        <w:rPr>
-          <w:sz w:val="22"/>
-        </w:rPr>
-        <w:t xml:space="preserve"> chequeo visual en navegador (Playwright / extensión de Chrome no disponibles en</w:t>
-      </w:r>
-    </w:p>
-    <w:p>
-      <w:pPr>
-        <w:spacing w:after="80"/>
-      </w:pPr>
-      <w:r>
-        <w:rPr>
-          <w:sz w:val="22"/>
-        </w:rPr>
-        <w:t xml:space="preserve">  las sesiones de desarrollo; todo lo demás verificado a nivel API y código).</w:t>
+        <w:t xml:space="preserve">Chequeo visual en navegador (16/7): hecho.</w:t>
+      </w:r>
+      <w:r>
+        <w:rPr>
+          <w:sz w:val="22"/>
+        </w:rPr>
+        <w:t xml:space="preserve"> Recorrido en Chrome (extensión de Claude) de</w:t>
+      </w:r>
+    </w:p>
+    <w:p>
+      <w:pPr>
+        <w:spacing w:after="80"/>
+      </w:pPr>
+      <w:r>
+        <w:rPr>
+          <w:sz w:val="22"/>
+        </w:rPr>
+        <w:t xml:space="preserve">  todas las vistas: panel con ITH en vivo, y las 4 nuevas (Alimento con ingreso probado 0→3000 kg,</w:t>
+      </w:r>
+    </w:p>
+    <w:p>
+      <w:pPr>
+        <w:spacing w:after="80"/>
+      </w:pPr>
+      <w:r>
+        <w:rPr>
+          <w:sz w:val="22"/>
+        </w:rPr>
+        <w:t xml:space="preserve">  Medicamentos, Movimientos, y Avisos con Equipo + Umbrales). Consola sin errores tras recarga.</w:t>
       </w:r>
     </w:p>
     <w:p>
@@ -2924,31 +2935,6 @@
     </w:p>
     <w:p>
       <w:pPr>
-        <w:ind w:left="360"/>
-        <w:spacing w:after="20"/>
-      </w:pPr>
-      <w:r>
-        <w:rPr>
-          <w:sz w:val="22"/>
-        </w:rPr>
-        <w:t xml:space="preserve">•  </w:t>
-      </w:r>
-      <w:r>
-        <w:rPr>
-          <w:sz w:val="22"/>
-          <w:b/>
-        </w:rPr>
-        <w:t xml:space="preserve">Chequeo visual en navegador:</w:t>
-      </w:r>
-      <w:r>
-        <w:rPr>
-          <w:sz w:val="22"/>
-        </w:rPr>
-        <w:t xml:space="preserve"> pendiente (ver sección 9).</w:t>
-      </w:r>
-    </w:p>
-    <w:p>
-      <w:pPr>
         <w:spacing w:before="200" w:after="100"/>
       </w:pPr>
       <w:r>
@@ -3024,17 +3010,6 @@
           <w:sz w:val="22"/>
         </w:rPr>
         <w:t xml:space="preserve">6. Conectar Twilio para WhatsApp real.</w:t>
-      </w:r>
-    </w:p>
-    <w:p>
-      <w:pPr>
-        <w:spacing w:after="80"/>
-      </w:pPr>
-      <w:r>
-        <w:rPr>
-          <w:sz w:val="22"/>
-        </w:rPr>
-        <w:t xml:space="preserve">7. Correr el chequeo visual en navegador cuando esté disponible.</w:t>
       </w:r>
     </w:p>
     <w:p>

</xml_diff>